<commit_message>
docs(report): rewrite P1 intro and Qwen note in grant-proposal register (#295)
</commit_message>
<xml_diff>
--- a/research-world/evidence/contest-2026/report/技术方案报告-ResearchWorld-filled.docx
+++ b/research-world/evidence/contest-2026/report/技术方案报告-ResearchWorld-filled.docx
@@ -623,7 +623,7 @@
                 <w:b w:val="0"/>
                 <w:sz w:val="19"/>
               </w:rPr>
-              <w:t>本作品面向科学假设生成与研究计划设计：每题由独立 Qwen 作者 Session 校正题干前提、识别缺口、核验证据、生成三个可区分方向、比较筛选并形成含 planned/executed 边界的研究计划；独立评审以六维 rubric（满分12）与来源门逐条核验引用，findings 驱动多轮修订。已完成官方125题全量：候选结论125/125，completed 8、partial 117、failed 0，2592次调用；五深度案例最终均12/12、来源门全过；旗舰 q049 由 V1 的 9/12 修订至 V8 的 12/12、来源 6/6。账本与哈希可回读，候选结论不等同已验证发现。</w:t>
+              <w:t>科学假设生成是连接开放科学问题与可检验研究计划的关键环节，而大模型直接作答难以区分已有事实与模型推断，也难以保证可检验性与引用可回溯。本作品构建作者、评审、修订相互制衡的研究工作流：独立 Qwen 作者会话校正题干前提、识别缺口并核验证据，生成三个机制不同的候选方向，经比较筛选形成标注计划与执行边界的研究计划；独立评审以六维量表与来源门逐条核验，评审发现回流驱动多轮修订。官方 125 题全量运行均形成候选结论（完成 8、部分 117、失败 0，2592 次调用）；五个深度案例经修订均达 12/12，旗舰案例由 9/12 修至 12/12。全部账本与哈希可回读，候选结论不等同于已验证发现。</w:t>
             </w:r>
           </w:p>
         </w:tc>
@@ -753,7 +753,7 @@
                 <w:b w:val="0"/>
                 <w:sz w:val="19"/>
               </w:rPr>
-              <w:t>本作品以 Qwen 系列为基座，经阿里云百炼 OpenAI 兼容端点调用：作者 Session 用 qwen3-max 完成问题理解、证据检索、三方向生成、比较筛选与研究计划；评审与回执用 gpt-5.6-sol、qwen3.7-max 等交叉执行，避免自评偏置。上下文按层拼接系统协议、canonical 原题、来源记录、历史 findings 与 planned/executed 边界；评审侧仅见固定 rubric 与被审版本，引用独立检索核验。verdict=revise 时 findings 逐条回流触发修订，形成多轮闭环；调用、token 与输出哈希均入账本可审计。</w:t>
+              <w:t>本作品以 Qwen 系列模型为唯一作者基座，经阿里云百炼 OpenAI 兼容端点调用。作者会话采用 qwen3-max，分层拼接系统协议、规范原题、来源记录、历史评审发现与计划执行边界，完成问题理解、证据检索、方向生成、比较筛选与研究计划设计；为避免自评偏置，评审与回执环节由其他模型交叉执行，评审侧仅可见固定量表与被审版本，引用一律经独立检索复核。当评审结论为退回修订时，评审发现逐条回流触发新一轮修订，形成多轮闭环；模型调用、token 消耗与输出哈希全部入账本，支持事后审计与复现核验。</w:t>
             </w:r>
           </w:p>
         </w:tc>

</xml_diff>